<commit_message>
docs: finalize v0.12.0 release records
</commit_message>
<xml_diff>
--- a/user-docs/DeepSeek-Agent-V3-工作日志-0.12.0.docx
+++ b/user-docs/DeepSeek-Agent-V3-工作日志-0.12.0.docx
@@ -27,7 +27,7 @@
           <w:rFonts w:ascii="Arial" w:hAnsi="Arial" w:eastAsia="Microsoft YaHei"/>
           <w:sz w:val="21"/>
         </w:rPr>
-        <w:t>状态：v0.12.0 代码与离线发布门已完成；Git commit、tag、push 和远端核验将在最终发布步骤补记。用户 API 余额已耗尽，本轮明确不调用 DeepSeek API，在线认证延期。</w:t>
+        <w:t>状态：v0.12.0 代码与离线发布门已完成；实现提交 `c1fd3fa00a2457f65165dabb279e0df423868d0b` 已推送并核对远端 `main`。最终文档提交、`v0.12.0` tag 和 Actions 核验正在收口。用户 API 余额已耗尽，本轮明确不调用 DeepSeek API，在线认证延期。</w:t>
       </w:r>
     </w:p>
     <w:p/>
@@ -961,7 +961,7 @@
           <w:rFonts w:ascii="Arial" w:hAnsi="Arial" w:eastAsia="Microsoft YaHei"/>
           <w:sz w:val="21"/>
         </w:rPr>
-        <w:t>源码提交：待最终 Git 步骤补记</w:t>
+        <w:t>实现与离线验证提交：`c1fd3fa00a2457f65165dabb279e0df423868d0b`</w:t>
       </w:r>
     </w:p>
     <w:p>
@@ -973,7 +973,7 @@
           <w:rFonts w:ascii="Arial" w:hAnsi="Arial" w:eastAsia="Microsoft YaHei"/>
           <w:sz w:val="21"/>
         </w:rPr>
-        <w:t>`v0.12.0` tag：待最终 Git 步骤补记</w:t>
+        <w:t>GitHub 初次推送：成功；`origin/main` 已核对指向上述提交</w:t>
       </w:r>
     </w:p>
     <w:p>
@@ -985,7 +985,7 @@
           <w:rFonts w:ascii="Arial" w:hAnsi="Arial" w:eastAsia="Microsoft YaHei"/>
           <w:sz w:val="21"/>
         </w:rPr>
-        <w:t>GitHub `main`/tag：待最终 Git 步骤核验</w:t>
+        <w:t>最终发布元数据提交：由本日志所在的 `v0.12.0` tag 标识；提交无法在自身内容中递归写入自己的哈希</w:t>
       </w:r>
     </w:p>
     <w:p>
@@ -997,7 +997,19 @@
           <w:rFonts w:ascii="Arial" w:hAnsi="Arial" w:eastAsia="Microsoft YaHei"/>
           <w:sz w:val="21"/>
         </w:rPr>
-        <w:t>GitHub Actions：待推送后核验</w:t>
+        <w:t>`v0.12.0` tag 与最终 `main`：本日志提交后创建、推送并由外部命令核验</w:t>
+      </w:r>
+    </w:p>
+    <w:p>
+      <w:pPr>
+        <w:pStyle w:val="ListBullet"/>
+      </w:pPr>
+      <w:r>
+        <w:rPr>
+          <w:rFonts w:ascii="Arial" w:hAnsi="Arial" w:eastAsia="Microsoft YaHei"/>
+          <w:sz w:val="21"/>
+        </w:rPr>
+        <w:t>GitHub Actions：最终推送后核验；在线 DeepSeek 认证不属于 Actions 发布门</w:t>
       </w:r>
     </w:p>
     <w:p/>

</xml_diff>